<commit_message>
Actualización repositorio semana 10
</commit_message>
<xml_diff>
--- a/Proyecto Integrador.docx
+++ b/Proyecto Integrador.docx
@@ -110,6 +110,7 @@
           <w:szCs w:val="24"/>
         </w:rPr>
       </w:pPr>
+      <w:proofErr w:type="gramStart"/>
       <w:r>
         <w:rPr>
           <w:sz w:val="24"/>
@@ -117,6 +118,7 @@
         </w:rPr>
         <w:t>Control estudiantes</w:t>
       </w:r>
+      <w:proofErr w:type="gramEnd"/>
     </w:p>
     <w:p>
       <w:pPr>
@@ -234,6 +236,7 @@
       <w:r>
         <w:t xml:space="preserve">Un </w:t>
       </w:r>
+      <w:proofErr w:type="spellStart"/>
       <w:r>
         <w:rPr>
           <w:i/>
@@ -241,11 +244,36 @@
         </w:rPr>
         <w:t>wireframe</w:t>
       </w:r>
+      <w:proofErr w:type="spellEnd"/>
       <w:r>
         <w:t xml:space="preserve"> (boceto a mano o digital muy simple) de las 3 secciones principales de su sitio.</w:t>
       </w:r>
       <w:r>
-        <w:t xml:space="preserve"> (header – body - footer) </w:t>
+        <w:t xml:space="preserve"> (</w:t>
+      </w:r>
+      <w:proofErr w:type="spellStart"/>
+      <w:r>
+        <w:t>header</w:t>
+      </w:r>
+      <w:proofErr w:type="spellEnd"/>
+      <w:r>
+        <w:t xml:space="preserve"> – </w:t>
+      </w:r>
+      <w:proofErr w:type="spellStart"/>
+      <w:r>
+        <w:t>body</w:t>
+      </w:r>
+      <w:proofErr w:type="spellEnd"/>
+      <w:r>
+        <w:t xml:space="preserve"> - </w:t>
+      </w:r>
+      <w:proofErr w:type="spellStart"/>
+      <w:r>
+        <w:t>footer</w:t>
+      </w:r>
+      <w:proofErr w:type="spellEnd"/>
+      <w:r>
+        <w:t xml:space="preserve">) </w:t>
       </w:r>
     </w:p>
     <w:p>
@@ -260,6 +288,7 @@
       <w:r>
         <w:t xml:space="preserve">Creación de un repositorio, </w:t>
       </w:r>
+      <w:proofErr w:type="spellStart"/>
       <w:r>
         <w:rPr>
           <w:i/>
@@ -267,9 +296,11 @@
         </w:rPr>
         <w:t>commits</w:t>
       </w:r>
+      <w:proofErr w:type="spellEnd"/>
       <w:r>
         <w:t xml:space="preserve"> frecuentes y uso de </w:t>
       </w:r>
+      <w:proofErr w:type="spellStart"/>
       <w:r>
         <w:rPr>
           <w:i/>
@@ -277,6 +308,7 @@
         </w:rPr>
         <w:t>branches</w:t>
       </w:r>
+      <w:proofErr w:type="spellEnd"/>
       <w:r>
         <w:t>.</w:t>
       </w:r>
@@ -311,10 +343,31 @@
         <w:t>sin NADA de CSS aplicado aún</w:t>
       </w:r>
       <w:r>
-        <w:t>. Logeo, registro, recuperar contraseña, contactenos</w:t>
-      </w:r>
-      <w:r>
-        <w:t>, landing page</w:t>
+        <w:t xml:space="preserve">. </w:t>
+      </w:r>
+      <w:proofErr w:type="spellStart"/>
+      <w:r>
+        <w:t>Logeo</w:t>
+      </w:r>
+      <w:proofErr w:type="spellEnd"/>
+      <w:r>
+        <w:t xml:space="preserve">, registro, recuperar contraseña, </w:t>
+      </w:r>
+      <w:proofErr w:type="spellStart"/>
+      <w:r>
+        <w:t>contactenos</w:t>
+      </w:r>
+      <w:proofErr w:type="spellEnd"/>
+      <w:r>
+        <w:t xml:space="preserve">, </w:t>
+      </w:r>
+      <w:proofErr w:type="spellStart"/>
+      <w:r>
+        <w:t>landing</w:t>
+      </w:r>
+      <w:proofErr w:type="spellEnd"/>
+      <w:r>
+        <w:t xml:space="preserve"> page</w:t>
       </w:r>
     </w:p>
     <w:p>
@@ -352,6 +405,7 @@
       <w:r>
         <w:t>Comprensión de la semántica HTML (</w:t>
       </w:r>
+      <w:proofErr w:type="spellStart"/>
       <w:r>
         <w:rPr>
           <w:i/>
@@ -359,9 +413,11 @@
         </w:rPr>
         <w:t>header</w:t>
       </w:r>
+      <w:proofErr w:type="spellEnd"/>
       <w:r>
         <w:t xml:space="preserve">, </w:t>
       </w:r>
+      <w:proofErr w:type="spellStart"/>
       <w:r>
         <w:rPr>
           <w:i/>
@@ -369,9 +425,11 @@
         </w:rPr>
         <w:t>nav</w:t>
       </w:r>
+      <w:proofErr w:type="spellEnd"/>
       <w:r>
         <w:t xml:space="preserve">, </w:t>
       </w:r>
+      <w:proofErr w:type="spellStart"/>
       <w:r>
         <w:rPr>
           <w:i/>
@@ -379,9 +437,11 @@
         </w:rPr>
         <w:t>main</w:t>
       </w:r>
+      <w:proofErr w:type="spellEnd"/>
       <w:r>
         <w:t xml:space="preserve">, </w:t>
       </w:r>
+      <w:proofErr w:type="spellStart"/>
       <w:r>
         <w:rPr>
           <w:i/>
@@ -389,6 +449,7 @@
         </w:rPr>
         <w:t>footer</w:t>
       </w:r>
+      <w:proofErr w:type="spellEnd"/>
       <w:r>
         <w:t>, etc.).</w:t>
       </w:r>
@@ -467,7 +528,23 @@
         <w:spacing w:after="0"/>
       </w:pPr>
       <w:r>
-        <w:t>Aplicar estilos y comprendiendo la elección clases, estilos reutilizables, y responsibidad de las páginas. Además, de implementación de etiquetas vistas en clase(clases, ID, elementos) y la aplicación del Modelo de Caja para una sección específica.</w:t>
+        <w:t xml:space="preserve">Aplicar estilos y comprendiendo la elección clases, estilos reutilizables, y </w:t>
+      </w:r>
+      <w:proofErr w:type="spellStart"/>
+      <w:r>
+        <w:t>responsibidad</w:t>
+      </w:r>
+      <w:proofErr w:type="spellEnd"/>
+      <w:r>
+        <w:t xml:space="preserve"> de las páginas. Además, de implementación de etiquetas vistas en </w:t>
+      </w:r>
+      <w:proofErr w:type="gramStart"/>
+      <w:r>
+        <w:t>clase(</w:t>
+      </w:r>
+      <w:proofErr w:type="gramEnd"/>
+      <w:r>
+        <w:t>clases, ID, elementos) y la aplicación del Modelo de Caja para una sección específica.</w:t>
       </w:r>
     </w:p>
     <w:p>
@@ -495,6 +572,7 @@
       <w:r>
         <w:t xml:space="preserve">Demostración de cómo se utiliza el inspector del navegador para </w:t>
       </w:r>
+      <w:proofErr w:type="spellStart"/>
       <w:r>
         <w:rPr>
           <w:i/>
@@ -502,6 +580,7 @@
         </w:rPr>
         <w:t>debuggear</w:t>
       </w:r>
+      <w:proofErr w:type="spellEnd"/>
       <w:r>
         <w:t xml:space="preserve"> y corregir problemas de posicionamiento.</w:t>
       </w:r>
@@ -524,7 +603,23 @@
           <w:b/>
           <w:bCs/>
         </w:rPr>
-        <w:t>colores, fuentes y un layout organizado</w:t>
+        <w:t xml:space="preserve">colores, fuentes y un </w:t>
+      </w:r>
+      <w:proofErr w:type="spellStart"/>
+      <w:r>
+        <w:rPr>
+          <w:b/>
+          <w:bCs/>
+        </w:rPr>
+        <w:t>layout</w:t>
+      </w:r>
+      <w:proofErr w:type="spellEnd"/>
+      <w:r>
+        <w:rPr>
+          <w:b/>
+          <w:bCs/>
+        </w:rPr>
+        <w:t xml:space="preserve"> organizado</w:t>
       </w:r>
       <w:r>
         <w:t xml:space="preserve">. El </w:t>
@@ -577,7 +672,31 @@
         <w:spacing w:after="0"/>
       </w:pPr>
       <w:r>
-        <w:t>Manejo de selectores, jerarquía CSS, y conocimiento de las propiedades margin, padding, y border.</w:t>
+        <w:t xml:space="preserve">Manejo de selectores, jerarquía CSS, y conocimiento de las propiedades </w:t>
+      </w:r>
+      <w:proofErr w:type="spellStart"/>
+      <w:r>
+        <w:t>margin</w:t>
+      </w:r>
+      <w:proofErr w:type="spellEnd"/>
+      <w:r>
+        <w:t xml:space="preserve">, </w:t>
+      </w:r>
+      <w:proofErr w:type="spellStart"/>
+      <w:r>
+        <w:t>padding</w:t>
+      </w:r>
+      <w:proofErr w:type="spellEnd"/>
+      <w:r>
+        <w:t xml:space="preserve">, y </w:t>
+      </w:r>
+      <w:proofErr w:type="spellStart"/>
+      <w:r>
+        <w:t>border</w:t>
+      </w:r>
+      <w:proofErr w:type="spellEnd"/>
+      <w:r>
+        <w:t>.</w:t>
       </w:r>
     </w:p>
     <w:p>
@@ -658,7 +777,31 @@
         <w:spacing w:after="0"/>
       </w:pPr>
       <w:r>
-        <w:t>Explicación de Flexbox/Framework: Exponer cómo se usó Flexbox para alinear el menú de navegación y cómo se integró el Framework (Tailwind) en una sección específica.</w:t>
+        <w:t xml:space="preserve">Explicación de </w:t>
+      </w:r>
+      <w:proofErr w:type="spellStart"/>
+      <w:r>
+        <w:t>Flexbox</w:t>
+      </w:r>
+      <w:proofErr w:type="spellEnd"/>
+      <w:r>
+        <w:t xml:space="preserve">/Framework: Exponer cómo se usó </w:t>
+      </w:r>
+      <w:proofErr w:type="spellStart"/>
+      <w:r>
+        <w:t>Flexbox</w:t>
+      </w:r>
+      <w:proofErr w:type="spellEnd"/>
+      <w:r>
+        <w:t xml:space="preserve"> para alinear el menú de navegación y cómo se integró el Framework (</w:t>
+      </w:r>
+      <w:proofErr w:type="spellStart"/>
+      <w:r>
+        <w:t>Tailwind</w:t>
+      </w:r>
+      <w:proofErr w:type="spellEnd"/>
+      <w:r>
+        <w:t>) en una sección específica.</w:t>
       </w:r>
     </w:p>
     <w:p>
@@ -671,8 +814,29 @@
         <w:spacing w:after="0"/>
       </w:pPr>
       <w:r>
-        <w:t>Demostrar cómo el sitio cambia su layout en diferentes tamaños de pantalla (móvil, tablet, desktop) usando tailwind</w:t>
-      </w:r>
+        <w:t xml:space="preserve">Demostrar cómo el sitio cambia su </w:t>
+      </w:r>
+      <w:proofErr w:type="spellStart"/>
+      <w:r>
+        <w:t>layout</w:t>
+      </w:r>
+      <w:proofErr w:type="spellEnd"/>
+      <w:r>
+        <w:t xml:space="preserve"> en diferentes tamaños de pantalla (móvil, </w:t>
+      </w:r>
+      <w:proofErr w:type="spellStart"/>
+      <w:r>
+        <w:t>tablet</w:t>
+      </w:r>
+      <w:proofErr w:type="spellEnd"/>
+      <w:r>
+        <w:t xml:space="preserve">, desktop) usando </w:t>
+      </w:r>
+      <w:proofErr w:type="spellStart"/>
+      <w:r>
+        <w:t>tailwind</w:t>
+      </w:r>
+      <w:proofErr w:type="spellEnd"/>
     </w:p>
     <w:p>
       <w:pPr>
@@ -751,6 +915,7 @@
       <w:r>
         <w:t xml:space="preserve">Comprensión de </w:t>
       </w:r>
+      <w:proofErr w:type="spellStart"/>
       <w:r>
         <w:rPr>
           <w:b/>
@@ -758,6 +923,7 @@
         </w:rPr>
         <w:t>Flexbox</w:t>
       </w:r>
+      <w:proofErr w:type="spellEnd"/>
       <w:r>
         <w:t xml:space="preserve"> (propiedades del contenedor e ítems) y la sintaxis del Framework.</w:t>
       </w:r>

</xml_diff>